<commit_message>
Day2-Summarizer: fix typos, guard core AI call, add project.md
Fixes "ingore" -> "ignore" in the student-facing prompt text and the
"aguments" variable typo, and wraps InvokePromptAsync in try/catch so
a bad key/rate limit/connectivity blip doesn't crash the program.
Syncs the docx's Complete Code listing and replaces missing.md with
project.md.
</commit_message>
<xml_diff>
--- a/Day2-Summarizer.docx
+++ b/Day2-Summarizer.docx
@@ -133,11 +133,7 @@
         <w:t>Prompt Templates</w:t>
       </w:r>
       <w:r>
-        <w:t>: A standardized set of instructions with pla</w:t>
-      </w:r>
-      <w:r>
-        <w:lastRenderedPageBreak/>
-        <w:t>ceholders, allowing the exact same AI instructions to be reused with different pieces of data.</w:t>
+        <w:t>: A standardized set of instructions with placeholders, allowing the exact same AI instructions to be reused with different pieces of data.</w:t>
       </w:r>
     </w:p>
     <w:p>
@@ -153,6 +149,7 @@
         <w:rPr>
           <w:b/>
         </w:rPr>
+        <w:lastRenderedPageBreak/>
         <w:t>The `{{$variable}}` syntax</w:t>
       </w:r>
       <w:r>
@@ -712,47 +709,47 @@
           <w:rFonts w:ascii="Consolas" w:hAnsi="Consolas"/>
           <w:sz w:val="19"/>
         </w:rPr>
-        <w:t xml:space="preserve">            string promptTemplate =</w:t>
-      </w:r>
+        <w:t xml:space="preserve">            string promptTemplate = @"</w:t>
+      </w:r>
+    </w:p>
+    <w:p>
+      <w:pPr>
+        <w:pStyle w:val="NoSpacing"/>
+        <w:rPr>
+          <w:rFonts w:ascii="Consolas" w:hAnsi="Consolas"/>
+          <w:sz w:val="19"/>
+        </w:rPr>
+      </w:pPr>
+      <w:r>
+        <w:rPr>
+          <w:rFonts w:ascii="Consolas" w:hAnsi="Consolas"/>
+          <w:sz w:val="19"/>
+        </w:rPr>
+        <w:t xml:space="preserve">                Read the following text and summarize it into exactly 3 bullet points.</w:t>
+      </w:r>
+    </w:p>
+    <w:p>
+      <w:pPr>
+        <w:pStyle w:val="NoSpacing"/>
+        <w:rPr>
+          <w:rFonts w:ascii="Consolas" w:hAnsi="Consolas"/>
+          <w:sz w:val="19"/>
+        </w:rPr>
+      </w:pPr>
       <w:r>
         <w:rPr>
           <w:rFonts w:ascii="Consolas" w:hAnsi="Consolas"/>
           <w:sz w:val="19"/>
         </w:rPr>
         <w:lastRenderedPageBreak/>
-        <w:t xml:space="preserve"> @"</w:t>
-      </w:r>
-    </w:p>
-    <w:p>
-      <w:pPr>
-        <w:pStyle w:val="NoSpacing"/>
-        <w:rPr>
-          <w:rFonts w:ascii="Consolas" w:hAnsi="Consolas"/>
-          <w:sz w:val="19"/>
-        </w:rPr>
-      </w:pPr>
-      <w:r>
-        <w:rPr>
-          <w:rFonts w:ascii="Consolas" w:hAnsi="Consolas"/>
-          <w:sz w:val="19"/>
-        </w:rPr>
-        <w:t xml:space="preserve">                Read the following text and summarize it into exactly 3 bullet points.</w:t>
-      </w:r>
-    </w:p>
-    <w:p>
-      <w:pPr>
-        <w:pStyle w:val="NoSpacing"/>
-        <w:rPr>
-          <w:rFonts w:ascii="Consolas" w:hAnsi="Consolas"/>
-          <w:sz w:val="19"/>
-        </w:rPr>
-      </w:pPr>
-      <w:r>
-        <w:rPr>
-          <w:rFonts w:ascii="Consolas" w:hAnsi="Consolas"/>
-          <w:sz w:val="19"/>
-        </w:rPr>
-        <w:t xml:space="preserve">                Focus on the main ideas and ingore minor details.</w:t>
+        <w:t xml:space="preserve">                </w:t>
+      </w:r>
+      <w:r>
+        <w:rPr>
+          <w:rFonts w:ascii="Consolas" w:hAnsi="Consolas"/>
+          <w:sz w:val="19"/>
+        </w:rPr>
+        <w:t>Focus on the main ideas and ignore minor details.</w:t>
       </w:r>
     </w:p>
     <w:p>
@@ -875,7 +872,7 @@
           <w:rFonts w:ascii="Consolas" w:hAnsi="Consolas"/>
           <w:sz w:val="19"/>
         </w:rPr>
-        <w:t xml:space="preserve">            var aguments = new KernelArguments</w:t>
+        <w:t xml:space="preserve">            var arguments = new KernelArguments</w:t>
       </w:r>
     </w:p>
     <w:p>
@@ -973,106 +970,257 @@
           <w:rFonts w:ascii="Consolas" w:hAnsi="Consolas"/>
           <w:sz w:val="19"/>
         </w:rPr>
-        <w:t xml:space="preserve">            // Step 5: Execute the prompt</w:t>
-      </w:r>
-    </w:p>
-    <w:p>
-      <w:pPr>
-        <w:pStyle w:val="NoSpacing"/>
-        <w:rPr>
-          <w:rFonts w:ascii="Consolas" w:hAnsi="Consolas"/>
-          <w:sz w:val="19"/>
-        </w:rPr>
-      </w:pPr>
-      <w:r>
-        <w:rPr>
-          <w:rFonts w:ascii="Consolas" w:hAnsi="Consolas"/>
-          <w:sz w:val="19"/>
-        </w:rPr>
-        <w:t xml:space="preserve">            var result = await kernel.InvokePromptAsync(promptTemplate, aguments);</w:t>
-      </w:r>
-    </w:p>
-    <w:p>
-      <w:pPr>
-        <w:pStyle w:val="NoSpacing"/>
-        <w:rPr>
-          <w:rFonts w:ascii="Consolas" w:hAnsi="Consolas"/>
-          <w:sz w:val="19"/>
-        </w:rPr>
-      </w:pPr>
-    </w:p>
-    <w:p>
-      <w:pPr>
-        <w:pStyle w:val="NoSpacing"/>
-        <w:rPr>
-          <w:rFonts w:ascii="Consolas" w:hAnsi="Consolas"/>
-          <w:sz w:val="19"/>
-        </w:rPr>
-      </w:pPr>
-      <w:r>
-        <w:rPr>
-          <w:rFonts w:ascii="Consolas" w:hAnsi="Consolas"/>
-          <w:sz w:val="19"/>
-        </w:rPr>
-        <w:t xml:space="preserve">            // Step 6: Display the result</w:t>
-      </w:r>
-    </w:p>
-    <w:p>
-      <w:pPr>
-        <w:pStyle w:val="NoSpacing"/>
-        <w:rPr>
-          <w:rFonts w:ascii="Consolas" w:hAnsi="Consolas"/>
-          <w:sz w:val="19"/>
-        </w:rPr>
-      </w:pPr>
-      <w:r>
-        <w:rPr>
-          <w:rFonts w:ascii="Consolas" w:hAnsi="Consolas"/>
-          <w:sz w:val="19"/>
-        </w:rPr>
-        <w:t xml:space="preserve">            Console.WriteLine("--- AI Summary ---");</w:t>
-      </w:r>
-    </w:p>
-    <w:p>
-      <w:pPr>
-        <w:pStyle w:val="NoSpacing"/>
-        <w:rPr>
-          <w:rFonts w:ascii="Consolas" w:hAnsi="Consolas"/>
-          <w:sz w:val="19"/>
-        </w:rPr>
-      </w:pPr>
-      <w:r>
-        <w:rPr>
-          <w:rFonts w:ascii="Consolas" w:hAnsi="Consolas"/>
-          <w:sz w:val="19"/>
-        </w:rPr>
-        <w:t xml:space="preserve">            Console.WriteLine(result.ToString());</w:t>
-      </w:r>
-    </w:p>
-    <w:p>
-      <w:pPr>
-        <w:pStyle w:val="NoSpacing"/>
-        <w:rPr>
-          <w:rFonts w:ascii="Consolas" w:hAnsi="Consolas"/>
-          <w:sz w:val="19"/>
-        </w:rPr>
-      </w:pPr>
-      <w:r>
-        <w:rPr>
-          <w:rFonts w:ascii="Consolas" w:hAnsi="Consolas"/>
-          <w:sz w:val="19"/>
-        </w:rPr>
-        <w:t xml:space="preserve">            Console.WriteLine("------------------");</w:t>
-      </w:r>
-    </w:p>
-    <w:p>
-      <w:pPr>
-        <w:pStyle w:val="NoSpacing"/>
-        <w:rPr>
-          <w:rFonts w:ascii="Consolas" w:hAnsi="Consolas"/>
-          <w:sz w:val="19"/>
-        </w:rPr>
-      </w:pPr>
+        <w:t xml:space="preserve">            // Step 5: Execute the prompt. Wrapped in try/catch because this is</w:t>
+      </w:r>
+    </w:p>
+    <w:p>
+      <w:pPr>
+        <w:pStyle w:val="NoSpacing"/>
+        <w:rPr>
+          <w:rFonts w:ascii="Consolas" w:hAnsi="Consolas"/>
+          <w:sz w:val="19"/>
+        </w:rPr>
+      </w:pPr>
+      <w:r>
+        <w:rPr>
+          <w:rFonts w:ascii="Consolas" w:hAnsi="Consolas"/>
+          <w:sz w:val="19"/>
+        </w:rPr>
+        <w:t xml:space="preserve">            // the network call to the model - a bad key, rate limit, or</w:t>
+      </w:r>
+    </w:p>
+    <w:p>
+      <w:pPr>
+        <w:pStyle w:val="NoSpacing"/>
+        <w:rPr>
+          <w:rFonts w:ascii="Consolas" w:hAnsi="Consolas"/>
+          <w:sz w:val="19"/>
+        </w:rPr>
+      </w:pPr>
+      <w:r>
+        <w:rPr>
+          <w:rFonts w:ascii="Consolas" w:hAnsi="Consolas"/>
+          <w:sz w:val="19"/>
+        </w:rPr>
+        <w:t xml:space="preserve">            // connectivity blip would otherwise crash the whole program with</w:t>
+      </w:r>
+    </w:p>
+    <w:p>
+      <w:pPr>
+        <w:pStyle w:val="NoSpacing"/>
+        <w:rPr>
+          <w:rFonts w:ascii="Consolas" w:hAnsi="Consolas"/>
+          <w:sz w:val="19"/>
+        </w:rPr>
+      </w:pPr>
+      <w:r>
+        <w:rPr>
+          <w:rFonts w:ascii="Consolas" w:hAnsi="Consolas"/>
+          <w:sz w:val="19"/>
+        </w:rPr>
+        <w:t xml:space="preserve">            // a raw stack trace instead of a readable message.</w:t>
+      </w:r>
+    </w:p>
+    <w:p>
+      <w:pPr>
+        <w:pStyle w:val="NoSpacing"/>
+        <w:rPr>
+          <w:rFonts w:ascii="Consolas" w:hAnsi="Consolas"/>
+          <w:sz w:val="19"/>
+        </w:rPr>
+      </w:pPr>
+      <w:r>
+        <w:rPr>
+          <w:rFonts w:ascii="Consolas" w:hAnsi="Consolas"/>
+          <w:sz w:val="19"/>
+        </w:rPr>
+        <w:t xml:space="preserve">            try</w:t>
+      </w:r>
+    </w:p>
+    <w:p>
+      <w:pPr>
+        <w:pStyle w:val="NoSpacing"/>
+        <w:rPr>
+          <w:rFonts w:ascii="Consolas" w:hAnsi="Consolas"/>
+          <w:sz w:val="19"/>
+        </w:rPr>
+      </w:pPr>
+      <w:r>
+        <w:rPr>
+          <w:rFonts w:ascii="Consolas" w:hAnsi="Consolas"/>
+          <w:sz w:val="19"/>
+        </w:rPr>
+        <w:t xml:space="preserve">            {</w:t>
+      </w:r>
+    </w:p>
+    <w:p>
+      <w:pPr>
+        <w:pStyle w:val="NoSpacing"/>
+        <w:rPr>
+          <w:rFonts w:ascii="Consolas" w:hAnsi="Consolas"/>
+          <w:sz w:val="19"/>
+        </w:rPr>
+      </w:pPr>
+      <w:r>
+        <w:rPr>
+          <w:rFonts w:ascii="Consolas" w:hAnsi="Consolas"/>
+          <w:sz w:val="19"/>
+        </w:rPr>
+        <w:t xml:space="preserve">                var result = await kernel.InvokePromptAsync(promptTemplate, arguments);</w:t>
+      </w:r>
+    </w:p>
+    <w:p>
+      <w:pPr>
+        <w:pStyle w:val="NoSpacing"/>
+        <w:rPr>
+          <w:rFonts w:ascii="Consolas" w:hAnsi="Consolas"/>
+          <w:sz w:val="19"/>
+        </w:rPr>
+      </w:pPr>
+    </w:p>
+    <w:p>
+      <w:pPr>
+        <w:pStyle w:val="NoSpacing"/>
+        <w:rPr>
+          <w:rFonts w:ascii="Consolas" w:hAnsi="Consolas"/>
+          <w:sz w:val="19"/>
+        </w:rPr>
+      </w:pPr>
+      <w:r>
+        <w:rPr>
+          <w:rFonts w:ascii="Consolas" w:hAnsi="Consolas"/>
+          <w:sz w:val="19"/>
+        </w:rPr>
+        <w:t xml:space="preserve">                // Step 6: Display the result</w:t>
+      </w:r>
+    </w:p>
+    <w:p>
+      <w:pPr>
+        <w:pStyle w:val="NoSpacing"/>
+        <w:rPr>
+          <w:rFonts w:ascii="Consolas" w:hAnsi="Consolas"/>
+          <w:sz w:val="19"/>
+        </w:rPr>
+      </w:pPr>
+      <w:r>
+        <w:rPr>
+          <w:rFonts w:ascii="Consolas" w:hAnsi="Consolas"/>
+          <w:sz w:val="19"/>
+        </w:rPr>
+        <w:t xml:space="preserve">                Console.WriteLine("--- AI Summary ---");</w:t>
+      </w:r>
+    </w:p>
+    <w:p>
+      <w:pPr>
+        <w:pStyle w:val="NoSpacing"/>
+        <w:rPr>
+          <w:rFonts w:ascii="Consolas" w:hAnsi="Consolas"/>
+          <w:sz w:val="19"/>
+        </w:rPr>
+      </w:pPr>
+      <w:r>
+        <w:rPr>
+          <w:rFonts w:ascii="Consolas" w:hAnsi="Consolas"/>
+          <w:sz w:val="19"/>
+        </w:rPr>
+        <w:t xml:space="preserve">                Console.WriteLine(result.ToString());</w:t>
+      </w:r>
+    </w:p>
+    <w:p>
+      <w:pPr>
+        <w:pStyle w:val="NoSpacing"/>
+        <w:rPr>
+          <w:rFonts w:ascii="Consolas" w:hAnsi="Consolas"/>
+          <w:sz w:val="19"/>
+        </w:rPr>
+      </w:pPr>
+      <w:r>
+        <w:rPr>
+          <w:rFonts w:ascii="Consolas" w:hAnsi="Consolas"/>
+          <w:sz w:val="19"/>
+        </w:rPr>
+        <w:t xml:space="preserve">                Console.WriteLine("------------------");</w:t>
+      </w:r>
+    </w:p>
+    <w:p>
+      <w:pPr>
+        <w:pStyle w:val="NoSpacing"/>
+        <w:rPr>
+          <w:rFonts w:ascii="Consolas" w:hAnsi="Consolas"/>
+          <w:sz w:val="19"/>
+        </w:rPr>
+      </w:pPr>
+      <w:r>
+        <w:rPr>
+          <w:rFonts w:ascii="Consolas" w:hAnsi="Consolas"/>
+          <w:sz w:val="19"/>
+        </w:rPr>
+        <w:t xml:space="preserve">            }</w:t>
+      </w:r>
+    </w:p>
+    <w:p>
+      <w:pPr>
+        <w:pStyle w:val="NoSpacing"/>
+        <w:rPr>
+          <w:rFonts w:ascii="Consolas" w:hAnsi="Consolas"/>
+          <w:sz w:val="19"/>
+        </w:rPr>
+      </w:pPr>
+      <w:r>
+        <w:rPr>
+          <w:rFonts w:ascii="Consolas" w:hAnsi="Consolas"/>
+          <w:sz w:val="19"/>
+        </w:rPr>
+        <w:t xml:space="preserve">            catch (Exception ex)</w:t>
+      </w:r>
+    </w:p>
+    <w:p>
+      <w:pPr>
+        <w:pStyle w:val="NoSpacing"/>
+        <w:rPr>
+          <w:rFonts w:ascii="Consolas" w:hAnsi="Consolas"/>
+          <w:sz w:val="19"/>
+        </w:rPr>
+      </w:pPr>
+      <w:r>
+        <w:rPr>
+          <w:rFonts w:ascii="Consolas" w:hAnsi="Consolas"/>
+          <w:sz w:val="19"/>
+        </w:rPr>
+        <w:t xml:space="preserve">            {</w:t>
+      </w:r>
+    </w:p>
+    <w:p>
+      <w:pPr>
+        <w:pStyle w:val="NoSpacing"/>
+        <w:rPr>
+          <w:rFonts w:ascii="Consolas" w:hAnsi="Consolas"/>
+          <w:sz w:val="19"/>
+        </w:rPr>
+      </w:pPr>
+      <w:r>
+        <w:rPr>
+          <w:rFonts w:ascii="Consolas" w:hAnsi="Consolas"/>
+          <w:sz w:val="19"/>
+        </w:rPr>
+        <w:t xml:space="preserve">                Console.WriteLine($"Summarization failed: {ex.Message}");</w:t>
+      </w:r>
+    </w:p>
+    <w:p>
+      <w:pPr>
+        <w:pStyle w:val="NoSpacing"/>
+        <w:rPr>
+          <w:rFonts w:ascii="Consolas" w:hAnsi="Consolas"/>
+          <w:sz w:val="19"/>
+        </w:rPr>
+      </w:pPr>
+      <w:r>
+        <w:rPr>
+          <w:rFonts w:ascii="Consolas" w:hAnsi="Consolas"/>
+          <w:sz w:val="19"/>
+        </w:rPr>
+        <w:t xml:space="preserve">            }</w:t>
+      </w:r>
     </w:p>
     <w:p>
       <w:pPr>
@@ -1377,6 +1525,7 @@
         <w:pStyle w:val="Heading2"/>
       </w:pPr>
       <w:r>
+        <w:lastRenderedPageBreak/>
         <w:t>5. Code Walkthrough &amp; Explanations</w:t>
       </w:r>
     </w:p>
@@ -1445,6 +1594,7 @@
         <w:rPr>
           <w:b/>
         </w:rPr>
+        <w:lastRenderedPageBreak/>
         <w:t>Step 6: Displaying the Result.</w:t>
       </w:r>
       <w:r>

</xml_diff>